<commit_message>
Exercise 7,8,9 and thermo lab data updated
</commit_message>
<xml_diff>
--- a/Session 4 - Thermo Lab/Thermo lab results.docx
+++ b/Session 4 - Thermo Lab/Thermo lab results.docx
@@ -215,15 +215,7 @@
                 <w:bCs/>
                 <w:lang w:val="en-US"/>
               </w:rPr>
-              <w:t>C</w:t>
-            </w:r>
-            <w:r>
-              <w:rPr>
-                <w:b/>
-                <w:bCs/>
-                <w:lang w:val="en-US"/>
-              </w:rPr>
-              <w:t>)</w:t>
+              <w:t>C)</w:t>
             </w:r>
           </w:p>
         </w:tc>
@@ -984,36 +976,48 @@
                 <w:lang w:val="en-US"/>
               </w:rPr>
             </w:pPr>
-          </w:p>
-        </w:tc>
-        <w:tc>
-          <w:tcPr>
-            <w:tcW w:w="1527" w:type="dxa"/>
-          </w:tcPr>
-          <w:p>
-            <w:pPr>
-              <w:rPr>
-                <w:lang w:val="en-US"/>
-              </w:rPr>
-            </w:pPr>
-            <w:r>
-              <w:rPr>
-                <w:lang w:val="en-US"/>
-              </w:rPr>
-              <w:t>22</w:t>
-            </w:r>
-          </w:p>
-        </w:tc>
-        <w:tc>
-          <w:tcPr>
-            <w:tcW w:w="1527" w:type="dxa"/>
-          </w:tcPr>
-          <w:p>
-            <w:pPr>
-              <w:rPr>
-                <w:lang w:val="en-US"/>
-              </w:rPr>
-            </w:pPr>
+            <w:r>
+              <w:rPr>
+                <w:lang w:val="en-US"/>
+              </w:rPr>
+              <w:t>86.3</w:t>
+            </w:r>
+          </w:p>
+        </w:tc>
+        <w:tc>
+          <w:tcPr>
+            <w:tcW w:w="1527" w:type="dxa"/>
+          </w:tcPr>
+          <w:p>
+            <w:pPr>
+              <w:rPr>
+                <w:lang w:val="en-US"/>
+              </w:rPr>
+            </w:pPr>
+            <w:r>
+              <w:rPr>
+                <w:lang w:val="en-US"/>
+              </w:rPr>
+              <w:t>17</w:t>
+            </w:r>
+          </w:p>
+        </w:tc>
+        <w:tc>
+          <w:tcPr>
+            <w:tcW w:w="1527" w:type="dxa"/>
+          </w:tcPr>
+          <w:p>
+            <w:pPr>
+              <w:rPr>
+                <w:lang w:val="en-US"/>
+              </w:rPr>
+            </w:pPr>
+            <w:r>
+              <w:rPr>
+                <w:lang w:val="en-US"/>
+              </w:rPr>
+              <w:t>5</w:t>
+            </w:r>
           </w:p>
         </w:tc>
         <w:tc>
@@ -1026,6 +1030,12 @@
                 <w:lang w:val="en-US"/>
               </w:rPr>
             </w:pPr>
+            <w:r>
+              <w:rPr>
+                <w:lang w:val="en-US"/>
+              </w:rPr>
+              <w:t>85.3</w:t>
+            </w:r>
           </w:p>
         </w:tc>
       </w:tr>
@@ -1107,36 +1117,48 @@
                 <w:lang w:val="en-US"/>
               </w:rPr>
             </w:pPr>
-          </w:p>
-        </w:tc>
-        <w:tc>
-          <w:tcPr>
-            <w:tcW w:w="1527" w:type="dxa"/>
-          </w:tcPr>
-          <w:p>
-            <w:pPr>
-              <w:rPr>
-                <w:lang w:val="en-US"/>
-              </w:rPr>
-            </w:pPr>
-            <w:r>
-              <w:rPr>
-                <w:lang w:val="en-US"/>
-              </w:rPr>
-              <w:t>21</w:t>
-            </w:r>
-          </w:p>
-        </w:tc>
-        <w:tc>
-          <w:tcPr>
-            <w:tcW w:w="1527" w:type="dxa"/>
-          </w:tcPr>
-          <w:p>
-            <w:pPr>
-              <w:rPr>
-                <w:lang w:val="en-US"/>
-              </w:rPr>
-            </w:pPr>
+            <w:r>
+              <w:rPr>
+                <w:lang w:val="en-US"/>
+              </w:rPr>
+              <w:t>86.3</w:t>
+            </w:r>
+          </w:p>
+        </w:tc>
+        <w:tc>
+          <w:tcPr>
+            <w:tcW w:w="1527" w:type="dxa"/>
+          </w:tcPr>
+          <w:p>
+            <w:pPr>
+              <w:rPr>
+                <w:lang w:val="en-US"/>
+              </w:rPr>
+            </w:pPr>
+            <w:r>
+              <w:rPr>
+                <w:lang w:val="en-US"/>
+              </w:rPr>
+              <w:t>18</w:t>
+            </w:r>
+          </w:p>
+        </w:tc>
+        <w:tc>
+          <w:tcPr>
+            <w:tcW w:w="1527" w:type="dxa"/>
+          </w:tcPr>
+          <w:p>
+            <w:pPr>
+              <w:rPr>
+                <w:lang w:val="en-US"/>
+              </w:rPr>
+            </w:pPr>
+            <w:r>
+              <w:rPr>
+                <w:lang w:val="en-US"/>
+              </w:rPr>
+              <w:t>6</w:t>
+            </w:r>
           </w:p>
         </w:tc>
         <w:tc>
@@ -1149,6 +1171,12 @@
                 <w:lang w:val="en-US"/>
               </w:rPr>
             </w:pPr>
+            <w:r>
+              <w:rPr>
+                <w:lang w:val="en-US"/>
+              </w:rPr>
+              <w:t>85.4</w:t>
+            </w:r>
           </w:p>
         </w:tc>
       </w:tr>
@@ -1227,42 +1255,54 @@
                 <w:lang w:val="en-US"/>
               </w:rPr>
             </w:pPr>
-          </w:p>
-        </w:tc>
-        <w:tc>
-          <w:tcPr>
-            <w:tcW w:w="1527" w:type="dxa"/>
-          </w:tcPr>
-          <w:p>
-            <w:pPr>
-              <w:rPr>
-                <w:lang w:val="en-US"/>
-              </w:rPr>
-            </w:pPr>
+            <w:r>
+              <w:rPr>
+                <w:lang w:val="en-US"/>
+              </w:rPr>
+              <w:t>86.</w:t>
+            </w:r>
             <w:r>
               <w:rPr>
                 <w:lang w:val="en-US"/>
               </w:rPr>
               <w:t>2</w:t>
             </w:r>
-            <w:r>
-              <w:rPr>
-                <w:lang w:val="en-US"/>
-              </w:rPr>
-              <w:t>1</w:t>
-            </w:r>
-          </w:p>
-        </w:tc>
-        <w:tc>
-          <w:tcPr>
-            <w:tcW w:w="1527" w:type="dxa"/>
-          </w:tcPr>
-          <w:p>
-            <w:pPr>
-              <w:rPr>
-                <w:lang w:val="en-US"/>
-              </w:rPr>
-            </w:pPr>
+          </w:p>
+        </w:tc>
+        <w:tc>
+          <w:tcPr>
+            <w:tcW w:w="1527" w:type="dxa"/>
+          </w:tcPr>
+          <w:p>
+            <w:pPr>
+              <w:rPr>
+                <w:lang w:val="en-US"/>
+              </w:rPr>
+            </w:pPr>
+            <w:r>
+              <w:rPr>
+                <w:lang w:val="en-US"/>
+              </w:rPr>
+              <w:t>18</w:t>
+            </w:r>
+          </w:p>
+        </w:tc>
+        <w:tc>
+          <w:tcPr>
+            <w:tcW w:w="1527" w:type="dxa"/>
+          </w:tcPr>
+          <w:p>
+            <w:pPr>
+              <w:rPr>
+                <w:lang w:val="en-US"/>
+              </w:rPr>
+            </w:pPr>
+            <w:r>
+              <w:rPr>
+                <w:lang w:val="en-US"/>
+              </w:rPr>
+              <w:t>7</w:t>
+            </w:r>
           </w:p>
         </w:tc>
         <w:tc>
@@ -1275,6 +1315,12 @@
                 <w:lang w:val="en-US"/>
               </w:rPr>
             </w:pPr>
+            <w:r>
+              <w:rPr>
+                <w:lang w:val="en-US"/>
+              </w:rPr>
+              <w:t>85.4</w:t>
+            </w:r>
           </w:p>
         </w:tc>
       </w:tr>

</xml_diff>